<commit_message>
Add request dashboard and enhance UI for document interaction
- Implemented a new request dashboard to monitor query performance and request history.
- Enhanced the Streamlit UI for better document interaction, including a persistent request dashboard and improved session management.
- Added functionality to display retrieved images with citations in the dashboard.
- Updated API interactions to handle session and request states more effectively.
- Improved error handling and user feedback for API interactions.
- Refactored code for better organization and maintainability.
</commit_message>
<xml_diff>
--- a/SystemDocuments.docx
+++ b/SystemDocuments.docx
@@ -52,7 +52,7 @@
         <w:pStyle w:val="ListParagraph"/>
         <w:numPr>
           <w:ilvl w:val="0"/>
-          <w:numId w:val="8"/>
+          <w:numId w:val="21"/>
         </w:numPr>
         <w:spacing w:before="0" w:after="60"/>
         <w:rPr/>
@@ -69,7 +69,7 @@
         <w:pStyle w:val="ListParagraph"/>
         <w:numPr>
           <w:ilvl w:val="0"/>
-          <w:numId w:val="9"/>
+          <w:numId w:val="22"/>
         </w:numPr>
         <w:spacing w:before="0" w:after="60"/>
         <w:rPr/>
@@ -86,7 +86,7 @@
         <w:pStyle w:val="ListParagraph"/>
         <w:numPr>
           <w:ilvl w:val="0"/>
-          <w:numId w:val="10"/>
+          <w:numId w:val="23"/>
         </w:numPr>
         <w:spacing w:before="0" w:after="60"/>
         <w:rPr/>
@@ -103,7 +103,7 @@
         <w:pStyle w:val="ListParagraph"/>
         <w:numPr>
           <w:ilvl w:val="0"/>
-          <w:numId w:val="11"/>
+          <w:numId w:val="24"/>
         </w:numPr>
         <w:spacing w:before="0" w:after="60"/>
         <w:rPr/>
@@ -187,31 +187,7 @@
         <w:rPr>
           <w:rFonts w:eastAsia="Arial" w:cs="Arial"/>
         </w:rPr>
-        <w:t>Câu hỏi → Guardrail vào → Viết lại câu (memory) → Hybrid search (đọc từ Qdrant) → Rerank → Dựng prompt → LLM Qwen3.</w:t>
-      </w:r>
-      <w:r>
-        <w:rPr>
-          <w:rFonts w:eastAsia="Arial" w:cs="Arial"/>
-        </w:rPr>
-        <w:t>5</w:t>
-      </w:r>
-      <w:r>
-        <w:rPr>
-          <w:rFonts w:eastAsia="Arial" w:cs="Arial"/>
-        </w:rPr>
-        <w:t xml:space="preserve"> </w:t>
-      </w:r>
-      <w:r>
-        <w:rPr>
-          <w:rFonts w:eastAsia="Arial" w:cs="Arial"/>
-        </w:rPr>
-        <w:t>4</w:t>
-      </w:r>
-      <w:r>
-        <w:rPr>
-          <w:rFonts w:eastAsia="Arial" w:cs="Arial"/>
-        </w:rPr>
-        <w:t>B → Guardrail ra → Trả lời + trích dẫn</w:t>
+        <w:t>Câu hỏi → Guardrail vào → Viết lại câu (memory) → Hybrid search (đọc từ Qdrant) → Rerank → Dựng prompt → LLM Qwen3.5 4B → Guardrail ra → Trả lời + trích dẫn</w:t>
       </w:r>
     </w:p>
     <w:p>
@@ -537,47 +513,7 @@
                 <w:sz w:val="20"/>
                 <w:szCs w:val="20"/>
               </w:rPr>
-              <w:t>Qwen3.</w:t>
-            </w:r>
-            <w:r>
-              <w:rPr>
-                <w:rFonts w:eastAsia="Arial" w:cs="Arial"/>
-                <w:b w:val="false"/>
-                <w:bCs w:val="false"/>
-                <w:sz w:val="20"/>
-                <w:szCs w:val="20"/>
-              </w:rPr>
-              <w:t>5</w:t>
-            </w:r>
-            <w:r>
-              <w:rPr>
-                <w:rFonts w:eastAsia="Arial" w:cs="Arial"/>
-                <w:b w:val="false"/>
-                <w:bCs w:val="false"/>
-                <w:sz w:val="20"/>
-                <w:szCs w:val="20"/>
-              </w:rPr>
-              <w:t xml:space="preserve"> </w:t>
-            </w:r>
-            <w:r>
-              <w:rPr>
-                <w:rFonts w:eastAsia="Arial" w:cs="Arial"/>
-                <w:b w:val="false"/>
-                <w:bCs w:val="false"/>
-                <w:sz w:val="20"/>
-                <w:szCs w:val="20"/>
-              </w:rPr>
-              <w:t>4</w:t>
-            </w:r>
-            <w:r>
-              <w:rPr>
-                <w:rFonts w:eastAsia="Arial" w:cs="Arial"/>
-                <w:b w:val="false"/>
-                <w:bCs w:val="false"/>
-                <w:sz w:val="20"/>
-                <w:szCs w:val="20"/>
-              </w:rPr>
-              <w:t>B</w:t>
+              <w:t>Qwen3.5 4B</w:t>
             </w:r>
           </w:p>
         </w:tc>
@@ -1404,7 +1340,7 @@
         <w:pStyle w:val="ListParagraph"/>
         <w:numPr>
           <w:ilvl w:val="0"/>
-          <w:numId w:val="12"/>
+          <w:numId w:val="25"/>
         </w:numPr>
         <w:spacing w:before="0" w:after="60"/>
         <w:rPr/>
@@ -1421,7 +1357,7 @@
         <w:pStyle w:val="ListParagraph"/>
         <w:numPr>
           <w:ilvl w:val="0"/>
-          <w:numId w:val="13"/>
+          <w:numId w:val="26"/>
         </w:numPr>
         <w:spacing w:before="0" w:after="60"/>
         <w:rPr/>
@@ -1438,7 +1374,7 @@
         <w:pStyle w:val="ListParagraph"/>
         <w:numPr>
           <w:ilvl w:val="0"/>
-          <w:numId w:val="14"/>
+          <w:numId w:val="27"/>
         </w:numPr>
         <w:spacing w:before="0" w:after="60"/>
         <w:rPr/>
@@ -1455,7 +1391,7 @@
         <w:pStyle w:val="ListParagraph"/>
         <w:numPr>
           <w:ilvl w:val="0"/>
-          <w:numId w:val="15"/>
+          <w:numId w:val="28"/>
         </w:numPr>
         <w:spacing w:before="0" w:after="60"/>
         <w:rPr/>
@@ -1517,8 +1453,8 @@
         </w:tblCellMar>
       </w:tblPr>
       <w:tblGrid>
-        <w:gridCol w:w="1798"/>
-        <w:gridCol w:w="3002"/>
+        <w:gridCol w:w="1797"/>
+        <w:gridCol w:w="3003"/>
         <w:gridCol w:w="4226"/>
       </w:tblGrid>
       <w:tr>
@@ -1527,7 +1463,7 @@
         </w:trPr>
         <w:tc>
           <w:tcPr>
-            <w:tcW w:w="1798" w:type="dxa"/>
+            <w:tcW w:w="1797" w:type="dxa"/>
             <w:tcBorders>
               <w:top w:val="single" w:sz="4" w:space="0" w:color="BFBFBF"/>
               <w:left w:val="single" w:sz="4" w:space="0" w:color="BFBFBF"/>
@@ -1556,7 +1492,7 @@
         </w:tc>
         <w:tc>
           <w:tcPr>
-            <w:tcW w:w="3002" w:type="dxa"/>
+            <w:tcW w:w="3003" w:type="dxa"/>
             <w:tcBorders>
               <w:top w:val="single" w:sz="4" w:space="0" w:color="BFBFBF"/>
               <w:left w:val="single" w:sz="4" w:space="0" w:color="BFBFBF"/>
@@ -1617,7 +1553,7 @@
         <w:trPr/>
         <w:tc>
           <w:tcPr>
-            <w:tcW w:w="1798" w:type="dxa"/>
+            <w:tcW w:w="1797" w:type="dxa"/>
             <w:tcBorders>
               <w:top w:val="single" w:sz="4" w:space="0" w:color="BFBFBF"/>
               <w:left w:val="single" w:sz="4" w:space="0" w:color="BFBFBF"/>
@@ -1645,7 +1581,7 @@
         </w:tc>
         <w:tc>
           <w:tcPr>
-            <w:tcW w:w="3002" w:type="dxa"/>
+            <w:tcW w:w="3003" w:type="dxa"/>
             <w:tcBorders>
               <w:top w:val="single" w:sz="4" w:space="0" w:color="BFBFBF"/>
               <w:left w:val="single" w:sz="4" w:space="0" w:color="BFBFBF"/>
@@ -1704,7 +1640,7 @@
         <w:trPr/>
         <w:tc>
           <w:tcPr>
-            <w:tcW w:w="1798" w:type="dxa"/>
+            <w:tcW w:w="1797" w:type="dxa"/>
             <w:tcBorders>
               <w:top w:val="single" w:sz="4" w:space="0" w:color="BFBFBF"/>
               <w:left w:val="single" w:sz="4" w:space="0" w:color="BFBFBF"/>
@@ -1732,7 +1668,7 @@
         </w:tc>
         <w:tc>
           <w:tcPr>
-            <w:tcW w:w="3002" w:type="dxa"/>
+            <w:tcW w:w="3003" w:type="dxa"/>
             <w:tcBorders>
               <w:top w:val="single" w:sz="4" w:space="0" w:color="BFBFBF"/>
               <w:left w:val="single" w:sz="4" w:space="0" w:color="BFBFBF"/>
@@ -1782,7 +1718,7 @@
                 <w:sz w:val="20"/>
                 <w:szCs w:val="20"/>
               </w:rPr>
-              <w:t>BM25</w:t>
+              <w:t>bge-m3</w:t>
             </w:r>
           </w:p>
         </w:tc>
@@ -1839,7 +1775,7 @@
         <w:pStyle w:val="ListParagraph"/>
         <w:numPr>
           <w:ilvl w:val="0"/>
-          <w:numId w:val="16"/>
+          <w:numId w:val="29"/>
         </w:numPr>
         <w:spacing w:before="0" w:after="60"/>
         <w:rPr/>
@@ -1856,7 +1792,7 @@
         <w:pStyle w:val="ListParagraph"/>
         <w:numPr>
           <w:ilvl w:val="0"/>
-          <w:numId w:val="17"/>
+          <w:numId w:val="30"/>
         </w:numPr>
         <w:spacing w:before="0" w:after="60"/>
         <w:rPr/>
@@ -1873,7 +1809,7 @@
         <w:pStyle w:val="ListParagraph"/>
         <w:numPr>
           <w:ilvl w:val="0"/>
-          <w:numId w:val="18"/>
+          <w:numId w:val="31"/>
         </w:numPr>
         <w:spacing w:before="0" w:after="60"/>
         <w:rPr/>
@@ -1890,7 +1826,7 @@
         <w:pStyle w:val="ListParagraph"/>
         <w:numPr>
           <w:ilvl w:val="0"/>
-          <w:numId w:val="19"/>
+          <w:numId w:val="32"/>
         </w:numPr>
         <w:spacing w:before="0" w:after="60"/>
         <w:rPr/>
@@ -1943,7 +1879,7 @@
         <w:pStyle w:val="ListParagraph"/>
         <w:numPr>
           <w:ilvl w:val="0"/>
-          <w:numId w:val="20"/>
+          <w:numId w:val="33"/>
         </w:numPr>
         <w:spacing w:before="0" w:after="60"/>
         <w:rPr/>
@@ -1960,7 +1896,7 @@
         <w:pStyle w:val="ListParagraph"/>
         <w:numPr>
           <w:ilvl w:val="0"/>
-          <w:numId w:val="21"/>
+          <w:numId w:val="34"/>
         </w:numPr>
         <w:spacing w:before="0" w:after="60"/>
         <w:rPr/>
@@ -1977,7 +1913,7 @@
         <w:pStyle w:val="ListParagraph"/>
         <w:numPr>
           <w:ilvl w:val="0"/>
-          <w:numId w:val="22"/>
+          <w:numId w:val="35"/>
         </w:numPr>
         <w:spacing w:before="0" w:after="60"/>
         <w:rPr/>
@@ -1994,7 +1930,7 @@
         <w:pStyle w:val="ListParagraph"/>
         <w:numPr>
           <w:ilvl w:val="0"/>
-          <w:numId w:val="23"/>
+          <w:numId w:val="36"/>
         </w:numPr>
         <w:spacing w:before="0" w:after="60"/>
         <w:rPr/>
@@ -2053,7 +1989,7 @@
         <w:pStyle w:val="ListParagraph"/>
         <w:numPr>
           <w:ilvl w:val="0"/>
-          <w:numId w:val="24"/>
+          <w:numId w:val="37"/>
         </w:numPr>
         <w:spacing w:before="0" w:after="60"/>
         <w:rPr/>
@@ -2070,7 +2006,7 @@
         <w:pStyle w:val="ListParagraph"/>
         <w:numPr>
           <w:ilvl w:val="0"/>
-          <w:numId w:val="25"/>
+          <w:numId w:val="38"/>
         </w:numPr>
         <w:spacing w:before="0" w:after="60"/>
         <w:rPr/>
@@ -2087,7 +2023,7 @@
         <w:pStyle w:val="ListParagraph"/>
         <w:numPr>
           <w:ilvl w:val="0"/>
-          <w:numId w:val="26"/>
+          <w:numId w:val="39"/>
         </w:numPr>
         <w:spacing w:before="0" w:after="60"/>
         <w:rPr/>
@@ -2271,8 +2207,8 @@
   <w:abstractNum w:abstractNumId="2">
     <w:lvl w:ilvl="0">
       <w:start w:val="1"/>
-      <w:numFmt w:val="decimal"/>
-      <w:lvlText w:val="%1."/>
+      <w:numFmt w:val="bullet"/>
+      <w:lvlText w:val=""/>
       <w:lvlJc w:val="left"/>
       <w:pPr>
         <w:tabs>
@@ -2280,7 +2216,9 @@
         </w:tabs>
         <w:ind w:left="720" w:hanging="360"/>
       </w:pPr>
-      <w:rPr/>
+      <w:rPr>
+        <w:rFonts w:ascii="Symbol" w:hAnsi="Symbol" w:cs="Symbol" w:hint="default"/>
+      </w:rPr>
     </w:lvl>
     <w:lvl w:ilvl="1">
       <w:start w:val="1"/>
@@ -2390,8 +2328,8 @@
   <w:abstractNum w:abstractNumId="3">
     <w:lvl w:ilvl="0">
       <w:start w:val="1"/>
-      <w:numFmt w:val="decimal"/>
-      <w:lvlText w:val="%1."/>
+      <w:numFmt w:val="bullet"/>
+      <w:lvlText w:val=""/>
       <w:lvlJc w:val="left"/>
       <w:pPr>
         <w:tabs>
@@ -2399,7 +2337,9 @@
         </w:tabs>
         <w:ind w:left="720" w:hanging="360"/>
       </w:pPr>
-      <w:rPr/>
+      <w:rPr>
+        <w:rFonts w:ascii="Symbol" w:hAnsi="Symbol" w:cs="Symbol" w:hint="default"/>
+      </w:rPr>
     </w:lvl>
     <w:lvl w:ilvl="1">
       <w:start w:val="1"/>
@@ -2630,8 +2570,8 @@
   <w:abstractNum w:abstractNumId="5">
     <w:lvl w:ilvl="0">
       <w:start w:val="1"/>
-      <w:numFmt w:val="decimal"/>
-      <w:lvlText w:val="%1."/>
+      <w:numFmt w:val="bullet"/>
+      <w:lvlText w:val=""/>
       <w:lvlJc w:val="left"/>
       <w:pPr>
         <w:tabs>
@@ -2639,7 +2579,9 @@
         </w:tabs>
         <w:ind w:left="720" w:hanging="360"/>
       </w:pPr>
-      <w:rPr/>
+      <w:rPr>
+        <w:rFonts w:ascii="Symbol" w:hAnsi="Symbol" w:cs="Symbol" w:hint="default"/>
+      </w:rPr>
     </w:lvl>
     <w:lvl w:ilvl="1">
       <w:start w:val="1"/>
@@ -2749,8 +2691,8 @@
   <w:abstractNum w:abstractNumId="6">
     <w:lvl w:ilvl="0">
       <w:start w:val="1"/>
-      <w:numFmt w:val="decimal"/>
-      <w:lvlText w:val="%1."/>
+      <w:numFmt w:val="bullet"/>
+      <w:lvlText w:val=""/>
       <w:lvlJc w:val="left"/>
       <w:pPr>
         <w:tabs>
@@ -2758,7 +2700,9 @@
         </w:tabs>
         <w:ind w:left="720" w:hanging="360"/>
       </w:pPr>
-      <w:rPr/>
+      <w:rPr>
+        <w:rFonts w:ascii="Symbol" w:hAnsi="Symbol" w:cs="Symbol" w:hint="default"/>
+      </w:rPr>
     </w:lvl>
     <w:lvl w:ilvl="1">
       <w:start w:val="1"/>
@@ -2866,6 +2810,1563 @@
     </w:lvl>
   </w:abstractNum>
   <w:abstractNum w:abstractNumId="7">
+    <w:lvl w:ilvl="0">
+      <w:start w:val="1"/>
+      <w:numFmt w:val="bullet"/>
+      <w:lvlText w:val=""/>
+      <w:lvlJc w:val="left"/>
+      <w:pPr>
+        <w:tabs>
+          <w:tab w:val="num" w:pos="0"/>
+        </w:tabs>
+        <w:ind w:left="720" w:hanging="360"/>
+      </w:pPr>
+      <w:rPr>
+        <w:rFonts w:ascii="Symbol" w:hAnsi="Symbol" w:cs="Symbol" w:hint="default"/>
+      </w:rPr>
+    </w:lvl>
+    <w:lvl w:ilvl="1">
+      <w:start w:val="1"/>
+      <w:numFmt w:val="decimal"/>
+      <w:lvlText w:val="%2."/>
+      <w:lvlJc w:val="left"/>
+      <w:pPr>
+        <w:tabs>
+          <w:tab w:val="num" w:pos="1080"/>
+        </w:tabs>
+        <w:ind w:left="1080" w:hanging="360"/>
+      </w:pPr>
+      <w:rPr/>
+    </w:lvl>
+    <w:lvl w:ilvl="2">
+      <w:start w:val="1"/>
+      <w:numFmt w:val="decimal"/>
+      <w:lvlText w:val="%3."/>
+      <w:lvlJc w:val="left"/>
+      <w:pPr>
+        <w:tabs>
+          <w:tab w:val="num" w:pos="1440"/>
+        </w:tabs>
+        <w:ind w:left="1440" w:hanging="360"/>
+      </w:pPr>
+      <w:rPr/>
+    </w:lvl>
+    <w:lvl w:ilvl="3">
+      <w:start w:val="1"/>
+      <w:numFmt w:val="decimal"/>
+      <w:lvlText w:val="%4."/>
+      <w:lvlJc w:val="left"/>
+      <w:pPr>
+        <w:tabs>
+          <w:tab w:val="num" w:pos="1800"/>
+        </w:tabs>
+        <w:ind w:left="1800" w:hanging="360"/>
+      </w:pPr>
+      <w:rPr/>
+    </w:lvl>
+    <w:lvl w:ilvl="4">
+      <w:start w:val="1"/>
+      <w:numFmt w:val="decimal"/>
+      <w:lvlText w:val="%5."/>
+      <w:lvlJc w:val="left"/>
+      <w:pPr>
+        <w:tabs>
+          <w:tab w:val="num" w:pos="2160"/>
+        </w:tabs>
+        <w:ind w:left="2160" w:hanging="360"/>
+      </w:pPr>
+      <w:rPr/>
+    </w:lvl>
+    <w:lvl w:ilvl="5">
+      <w:start w:val="1"/>
+      <w:numFmt w:val="decimal"/>
+      <w:lvlText w:val="%6."/>
+      <w:lvlJc w:val="left"/>
+      <w:pPr>
+        <w:tabs>
+          <w:tab w:val="num" w:pos="2520"/>
+        </w:tabs>
+        <w:ind w:left="2520" w:hanging="360"/>
+      </w:pPr>
+      <w:rPr/>
+    </w:lvl>
+    <w:lvl w:ilvl="6">
+      <w:start w:val="1"/>
+      <w:numFmt w:val="decimal"/>
+      <w:lvlText w:val="%7."/>
+      <w:lvlJc w:val="left"/>
+      <w:pPr>
+        <w:tabs>
+          <w:tab w:val="num" w:pos="2880"/>
+        </w:tabs>
+        <w:ind w:left="2880" w:hanging="360"/>
+      </w:pPr>
+      <w:rPr/>
+    </w:lvl>
+    <w:lvl w:ilvl="7">
+      <w:start w:val="1"/>
+      <w:numFmt w:val="decimal"/>
+      <w:lvlText w:val="%8."/>
+      <w:lvlJc w:val="left"/>
+      <w:pPr>
+        <w:tabs>
+          <w:tab w:val="num" w:pos="3240"/>
+        </w:tabs>
+        <w:ind w:left="3240" w:hanging="360"/>
+      </w:pPr>
+      <w:rPr/>
+    </w:lvl>
+    <w:lvl w:ilvl="8">
+      <w:start w:val="1"/>
+      <w:numFmt w:val="decimal"/>
+      <w:lvlText w:val="%9."/>
+      <w:lvlJc w:val="left"/>
+      <w:pPr>
+        <w:tabs>
+          <w:tab w:val="num" w:pos="3600"/>
+        </w:tabs>
+        <w:ind w:left="3600" w:hanging="360"/>
+      </w:pPr>
+      <w:rPr/>
+    </w:lvl>
+  </w:abstractNum>
+  <w:abstractNum w:abstractNumId="8">
+    <w:lvl w:ilvl="0">
+      <w:start w:val="1"/>
+      <w:numFmt w:val="bullet"/>
+      <w:lvlText w:val=""/>
+      <w:lvlJc w:val="left"/>
+      <w:pPr>
+        <w:tabs>
+          <w:tab w:val="num" w:pos="0"/>
+        </w:tabs>
+        <w:ind w:left="720" w:hanging="360"/>
+      </w:pPr>
+      <w:rPr>
+        <w:rFonts w:ascii="Symbol" w:hAnsi="Symbol" w:cs="Symbol" w:hint="default"/>
+      </w:rPr>
+    </w:lvl>
+    <w:lvl w:ilvl="1">
+      <w:start w:val="1"/>
+      <w:numFmt w:val="decimal"/>
+      <w:lvlText w:val="%2."/>
+      <w:lvlJc w:val="left"/>
+      <w:pPr>
+        <w:tabs>
+          <w:tab w:val="num" w:pos="1080"/>
+        </w:tabs>
+        <w:ind w:left="1080" w:hanging="360"/>
+      </w:pPr>
+      <w:rPr/>
+    </w:lvl>
+    <w:lvl w:ilvl="2">
+      <w:start w:val="1"/>
+      <w:numFmt w:val="decimal"/>
+      <w:lvlText w:val="%3."/>
+      <w:lvlJc w:val="left"/>
+      <w:pPr>
+        <w:tabs>
+          <w:tab w:val="num" w:pos="1440"/>
+        </w:tabs>
+        <w:ind w:left="1440" w:hanging="360"/>
+      </w:pPr>
+      <w:rPr/>
+    </w:lvl>
+    <w:lvl w:ilvl="3">
+      <w:start w:val="1"/>
+      <w:numFmt w:val="decimal"/>
+      <w:lvlText w:val="%4."/>
+      <w:lvlJc w:val="left"/>
+      <w:pPr>
+        <w:tabs>
+          <w:tab w:val="num" w:pos="1800"/>
+        </w:tabs>
+        <w:ind w:left="1800" w:hanging="360"/>
+      </w:pPr>
+      <w:rPr/>
+    </w:lvl>
+    <w:lvl w:ilvl="4">
+      <w:start w:val="1"/>
+      <w:numFmt w:val="decimal"/>
+      <w:lvlText w:val="%5."/>
+      <w:lvlJc w:val="left"/>
+      <w:pPr>
+        <w:tabs>
+          <w:tab w:val="num" w:pos="2160"/>
+        </w:tabs>
+        <w:ind w:left="2160" w:hanging="360"/>
+      </w:pPr>
+      <w:rPr/>
+    </w:lvl>
+    <w:lvl w:ilvl="5">
+      <w:start w:val="1"/>
+      <w:numFmt w:val="decimal"/>
+      <w:lvlText w:val="%6."/>
+      <w:lvlJc w:val="left"/>
+      <w:pPr>
+        <w:tabs>
+          <w:tab w:val="num" w:pos="2520"/>
+        </w:tabs>
+        <w:ind w:left="2520" w:hanging="360"/>
+      </w:pPr>
+      <w:rPr/>
+    </w:lvl>
+    <w:lvl w:ilvl="6">
+      <w:start w:val="1"/>
+      <w:numFmt w:val="decimal"/>
+      <w:lvlText w:val="%7."/>
+      <w:lvlJc w:val="left"/>
+      <w:pPr>
+        <w:tabs>
+          <w:tab w:val="num" w:pos="2880"/>
+        </w:tabs>
+        <w:ind w:left="2880" w:hanging="360"/>
+      </w:pPr>
+      <w:rPr/>
+    </w:lvl>
+    <w:lvl w:ilvl="7">
+      <w:start w:val="1"/>
+      <w:numFmt w:val="decimal"/>
+      <w:lvlText w:val="%8."/>
+      <w:lvlJc w:val="left"/>
+      <w:pPr>
+        <w:tabs>
+          <w:tab w:val="num" w:pos="3240"/>
+        </w:tabs>
+        <w:ind w:left="3240" w:hanging="360"/>
+      </w:pPr>
+      <w:rPr/>
+    </w:lvl>
+    <w:lvl w:ilvl="8">
+      <w:start w:val="1"/>
+      <w:numFmt w:val="decimal"/>
+      <w:lvlText w:val="%9."/>
+      <w:lvlJc w:val="left"/>
+      <w:pPr>
+        <w:tabs>
+          <w:tab w:val="num" w:pos="3600"/>
+        </w:tabs>
+        <w:ind w:left="3600" w:hanging="360"/>
+      </w:pPr>
+      <w:rPr/>
+    </w:lvl>
+  </w:abstractNum>
+  <w:abstractNum w:abstractNumId="9">
+    <w:lvl w:ilvl="0">
+      <w:start w:val="1"/>
+      <w:numFmt w:val="decimal"/>
+      <w:lvlText w:val="%1."/>
+      <w:lvlJc w:val="left"/>
+      <w:pPr>
+        <w:tabs>
+          <w:tab w:val="num" w:pos="0"/>
+        </w:tabs>
+        <w:ind w:left="720" w:hanging="360"/>
+      </w:pPr>
+      <w:rPr/>
+    </w:lvl>
+    <w:lvl w:ilvl="1">
+      <w:start w:val="1"/>
+      <w:numFmt w:val="decimal"/>
+      <w:lvlText w:val="%2."/>
+      <w:lvlJc w:val="left"/>
+      <w:pPr>
+        <w:tabs>
+          <w:tab w:val="num" w:pos="1080"/>
+        </w:tabs>
+        <w:ind w:left="1080" w:hanging="360"/>
+      </w:pPr>
+      <w:rPr/>
+    </w:lvl>
+    <w:lvl w:ilvl="2">
+      <w:start w:val="1"/>
+      <w:numFmt w:val="decimal"/>
+      <w:lvlText w:val="%3."/>
+      <w:lvlJc w:val="left"/>
+      <w:pPr>
+        <w:tabs>
+          <w:tab w:val="num" w:pos="1440"/>
+        </w:tabs>
+        <w:ind w:left="1440" w:hanging="360"/>
+      </w:pPr>
+      <w:rPr/>
+    </w:lvl>
+    <w:lvl w:ilvl="3">
+      <w:start w:val="1"/>
+      <w:numFmt w:val="decimal"/>
+      <w:lvlText w:val="%4."/>
+      <w:lvlJc w:val="left"/>
+      <w:pPr>
+        <w:tabs>
+          <w:tab w:val="num" w:pos="1800"/>
+        </w:tabs>
+        <w:ind w:left="1800" w:hanging="360"/>
+      </w:pPr>
+      <w:rPr/>
+    </w:lvl>
+    <w:lvl w:ilvl="4">
+      <w:start w:val="1"/>
+      <w:numFmt w:val="decimal"/>
+      <w:lvlText w:val="%5."/>
+      <w:lvlJc w:val="left"/>
+      <w:pPr>
+        <w:tabs>
+          <w:tab w:val="num" w:pos="2160"/>
+        </w:tabs>
+        <w:ind w:left="2160" w:hanging="360"/>
+      </w:pPr>
+      <w:rPr/>
+    </w:lvl>
+    <w:lvl w:ilvl="5">
+      <w:start w:val="1"/>
+      <w:numFmt w:val="decimal"/>
+      <w:lvlText w:val="%6."/>
+      <w:lvlJc w:val="left"/>
+      <w:pPr>
+        <w:tabs>
+          <w:tab w:val="num" w:pos="2520"/>
+        </w:tabs>
+        <w:ind w:left="2520" w:hanging="360"/>
+      </w:pPr>
+      <w:rPr/>
+    </w:lvl>
+    <w:lvl w:ilvl="6">
+      <w:start w:val="1"/>
+      <w:numFmt w:val="decimal"/>
+      <w:lvlText w:val="%7."/>
+      <w:lvlJc w:val="left"/>
+      <w:pPr>
+        <w:tabs>
+          <w:tab w:val="num" w:pos="2880"/>
+        </w:tabs>
+        <w:ind w:left="2880" w:hanging="360"/>
+      </w:pPr>
+      <w:rPr/>
+    </w:lvl>
+    <w:lvl w:ilvl="7">
+      <w:start w:val="1"/>
+      <w:numFmt w:val="decimal"/>
+      <w:lvlText w:val="%8."/>
+      <w:lvlJc w:val="left"/>
+      <w:pPr>
+        <w:tabs>
+          <w:tab w:val="num" w:pos="3240"/>
+        </w:tabs>
+        <w:ind w:left="3240" w:hanging="360"/>
+      </w:pPr>
+      <w:rPr/>
+    </w:lvl>
+    <w:lvl w:ilvl="8">
+      <w:start w:val="1"/>
+      <w:numFmt w:val="decimal"/>
+      <w:lvlText w:val="%9."/>
+      <w:lvlJc w:val="left"/>
+      <w:pPr>
+        <w:tabs>
+          <w:tab w:val="num" w:pos="3600"/>
+        </w:tabs>
+        <w:ind w:left="3600" w:hanging="360"/>
+      </w:pPr>
+      <w:rPr/>
+    </w:lvl>
+  </w:abstractNum>
+  <w:abstractNum w:abstractNumId="10">
+    <w:lvl w:ilvl="0">
+      <w:start w:val="1"/>
+      <w:numFmt w:val="decimal"/>
+      <w:lvlText w:val="%1."/>
+      <w:lvlJc w:val="left"/>
+      <w:pPr>
+        <w:tabs>
+          <w:tab w:val="num" w:pos="0"/>
+        </w:tabs>
+        <w:ind w:left="720" w:hanging="360"/>
+      </w:pPr>
+      <w:rPr/>
+    </w:lvl>
+    <w:lvl w:ilvl="1">
+      <w:start w:val="1"/>
+      <w:numFmt w:val="decimal"/>
+      <w:lvlText w:val="%2."/>
+      <w:lvlJc w:val="left"/>
+      <w:pPr>
+        <w:tabs>
+          <w:tab w:val="num" w:pos="1080"/>
+        </w:tabs>
+        <w:ind w:left="1080" w:hanging="360"/>
+      </w:pPr>
+      <w:rPr/>
+    </w:lvl>
+    <w:lvl w:ilvl="2">
+      <w:start w:val="1"/>
+      <w:numFmt w:val="decimal"/>
+      <w:lvlText w:val="%3."/>
+      <w:lvlJc w:val="left"/>
+      <w:pPr>
+        <w:tabs>
+          <w:tab w:val="num" w:pos="1440"/>
+        </w:tabs>
+        <w:ind w:left="1440" w:hanging="360"/>
+      </w:pPr>
+      <w:rPr/>
+    </w:lvl>
+    <w:lvl w:ilvl="3">
+      <w:start w:val="1"/>
+      <w:numFmt w:val="decimal"/>
+      <w:lvlText w:val="%4."/>
+      <w:lvlJc w:val="left"/>
+      <w:pPr>
+        <w:tabs>
+          <w:tab w:val="num" w:pos="1800"/>
+        </w:tabs>
+        <w:ind w:left="1800" w:hanging="360"/>
+      </w:pPr>
+      <w:rPr/>
+    </w:lvl>
+    <w:lvl w:ilvl="4">
+      <w:start w:val="1"/>
+      <w:numFmt w:val="decimal"/>
+      <w:lvlText w:val="%5."/>
+      <w:lvlJc w:val="left"/>
+      <w:pPr>
+        <w:tabs>
+          <w:tab w:val="num" w:pos="2160"/>
+        </w:tabs>
+        <w:ind w:left="2160" w:hanging="360"/>
+      </w:pPr>
+      <w:rPr/>
+    </w:lvl>
+    <w:lvl w:ilvl="5">
+      <w:start w:val="1"/>
+      <w:numFmt w:val="decimal"/>
+      <w:lvlText w:val="%6."/>
+      <w:lvlJc w:val="left"/>
+      <w:pPr>
+        <w:tabs>
+          <w:tab w:val="num" w:pos="2520"/>
+        </w:tabs>
+        <w:ind w:left="2520" w:hanging="360"/>
+      </w:pPr>
+      <w:rPr/>
+    </w:lvl>
+    <w:lvl w:ilvl="6">
+      <w:start w:val="1"/>
+      <w:numFmt w:val="decimal"/>
+      <w:lvlText w:val="%7."/>
+      <w:lvlJc w:val="left"/>
+      <w:pPr>
+        <w:tabs>
+          <w:tab w:val="num" w:pos="2880"/>
+        </w:tabs>
+        <w:ind w:left="2880" w:hanging="360"/>
+      </w:pPr>
+      <w:rPr/>
+    </w:lvl>
+    <w:lvl w:ilvl="7">
+      <w:start w:val="1"/>
+      <w:numFmt w:val="decimal"/>
+      <w:lvlText w:val="%8."/>
+      <w:lvlJc w:val="left"/>
+      <w:pPr>
+        <w:tabs>
+          <w:tab w:val="num" w:pos="3240"/>
+        </w:tabs>
+        <w:ind w:left="3240" w:hanging="360"/>
+      </w:pPr>
+      <w:rPr/>
+    </w:lvl>
+    <w:lvl w:ilvl="8">
+      <w:start w:val="1"/>
+      <w:numFmt w:val="decimal"/>
+      <w:lvlText w:val="%9."/>
+      <w:lvlJc w:val="left"/>
+      <w:pPr>
+        <w:tabs>
+          <w:tab w:val="num" w:pos="3600"/>
+        </w:tabs>
+        <w:ind w:left="3600" w:hanging="360"/>
+      </w:pPr>
+      <w:rPr/>
+    </w:lvl>
+  </w:abstractNum>
+  <w:abstractNum w:abstractNumId="11">
+    <w:lvl w:ilvl="0">
+      <w:start w:val="1"/>
+      <w:numFmt w:val="decimal"/>
+      <w:lvlText w:val="%1."/>
+      <w:lvlJc w:val="left"/>
+      <w:pPr>
+        <w:tabs>
+          <w:tab w:val="num" w:pos="0"/>
+        </w:tabs>
+        <w:ind w:left="720" w:hanging="360"/>
+      </w:pPr>
+      <w:rPr/>
+    </w:lvl>
+    <w:lvl w:ilvl="1">
+      <w:start w:val="1"/>
+      <w:numFmt w:val="decimal"/>
+      <w:lvlText w:val="%2."/>
+      <w:lvlJc w:val="left"/>
+      <w:pPr>
+        <w:tabs>
+          <w:tab w:val="num" w:pos="1080"/>
+        </w:tabs>
+        <w:ind w:left="1080" w:hanging="360"/>
+      </w:pPr>
+      <w:rPr/>
+    </w:lvl>
+    <w:lvl w:ilvl="2">
+      <w:start w:val="1"/>
+      <w:numFmt w:val="decimal"/>
+      <w:lvlText w:val="%3."/>
+      <w:lvlJc w:val="left"/>
+      <w:pPr>
+        <w:tabs>
+          <w:tab w:val="num" w:pos="1440"/>
+        </w:tabs>
+        <w:ind w:left="1440" w:hanging="360"/>
+      </w:pPr>
+      <w:rPr/>
+    </w:lvl>
+    <w:lvl w:ilvl="3">
+      <w:start w:val="1"/>
+      <w:numFmt w:val="decimal"/>
+      <w:lvlText w:val="%4."/>
+      <w:lvlJc w:val="left"/>
+      <w:pPr>
+        <w:tabs>
+          <w:tab w:val="num" w:pos="1800"/>
+        </w:tabs>
+        <w:ind w:left="1800" w:hanging="360"/>
+      </w:pPr>
+      <w:rPr/>
+    </w:lvl>
+    <w:lvl w:ilvl="4">
+      <w:start w:val="1"/>
+      <w:numFmt w:val="decimal"/>
+      <w:lvlText w:val="%5."/>
+      <w:lvlJc w:val="left"/>
+      <w:pPr>
+        <w:tabs>
+          <w:tab w:val="num" w:pos="2160"/>
+        </w:tabs>
+        <w:ind w:left="2160" w:hanging="360"/>
+      </w:pPr>
+      <w:rPr/>
+    </w:lvl>
+    <w:lvl w:ilvl="5">
+      <w:start w:val="1"/>
+      <w:numFmt w:val="decimal"/>
+      <w:lvlText w:val="%6."/>
+      <w:lvlJc w:val="left"/>
+      <w:pPr>
+        <w:tabs>
+          <w:tab w:val="num" w:pos="2520"/>
+        </w:tabs>
+        <w:ind w:left="2520" w:hanging="360"/>
+      </w:pPr>
+      <w:rPr/>
+    </w:lvl>
+    <w:lvl w:ilvl="6">
+      <w:start w:val="1"/>
+      <w:numFmt w:val="decimal"/>
+      <w:lvlText w:val="%7."/>
+      <w:lvlJc w:val="left"/>
+      <w:pPr>
+        <w:tabs>
+          <w:tab w:val="num" w:pos="2880"/>
+        </w:tabs>
+        <w:ind w:left="2880" w:hanging="360"/>
+      </w:pPr>
+      <w:rPr/>
+    </w:lvl>
+    <w:lvl w:ilvl="7">
+      <w:start w:val="1"/>
+      <w:numFmt w:val="decimal"/>
+      <w:lvlText w:val="%8."/>
+      <w:lvlJc w:val="left"/>
+      <w:pPr>
+        <w:tabs>
+          <w:tab w:val="num" w:pos="3240"/>
+        </w:tabs>
+        <w:ind w:left="3240" w:hanging="360"/>
+      </w:pPr>
+      <w:rPr/>
+    </w:lvl>
+    <w:lvl w:ilvl="8">
+      <w:start w:val="1"/>
+      <w:numFmt w:val="decimal"/>
+      <w:lvlText w:val="%9."/>
+      <w:lvlJc w:val="left"/>
+      <w:pPr>
+        <w:tabs>
+          <w:tab w:val="num" w:pos="3600"/>
+        </w:tabs>
+        <w:ind w:left="3600" w:hanging="360"/>
+      </w:pPr>
+      <w:rPr/>
+    </w:lvl>
+  </w:abstractNum>
+  <w:abstractNum w:abstractNumId="12">
+    <w:lvl w:ilvl="0">
+      <w:start w:val="1"/>
+      <w:numFmt w:val="decimal"/>
+      <w:lvlText w:val="%1."/>
+      <w:lvlJc w:val="left"/>
+      <w:pPr>
+        <w:tabs>
+          <w:tab w:val="num" w:pos="0"/>
+        </w:tabs>
+        <w:ind w:left="720" w:hanging="360"/>
+      </w:pPr>
+      <w:rPr/>
+    </w:lvl>
+    <w:lvl w:ilvl="1">
+      <w:start w:val="1"/>
+      <w:numFmt w:val="decimal"/>
+      <w:lvlText w:val="%2."/>
+      <w:lvlJc w:val="left"/>
+      <w:pPr>
+        <w:tabs>
+          <w:tab w:val="num" w:pos="1080"/>
+        </w:tabs>
+        <w:ind w:left="1080" w:hanging="360"/>
+      </w:pPr>
+      <w:rPr/>
+    </w:lvl>
+    <w:lvl w:ilvl="2">
+      <w:start w:val="1"/>
+      <w:numFmt w:val="decimal"/>
+      <w:lvlText w:val="%3."/>
+      <w:lvlJc w:val="left"/>
+      <w:pPr>
+        <w:tabs>
+          <w:tab w:val="num" w:pos="1440"/>
+        </w:tabs>
+        <w:ind w:left="1440" w:hanging="360"/>
+      </w:pPr>
+      <w:rPr/>
+    </w:lvl>
+    <w:lvl w:ilvl="3">
+      <w:start w:val="1"/>
+      <w:numFmt w:val="decimal"/>
+      <w:lvlText w:val="%4."/>
+      <w:lvlJc w:val="left"/>
+      <w:pPr>
+        <w:tabs>
+          <w:tab w:val="num" w:pos="1800"/>
+        </w:tabs>
+        <w:ind w:left="1800" w:hanging="360"/>
+      </w:pPr>
+      <w:rPr/>
+    </w:lvl>
+    <w:lvl w:ilvl="4">
+      <w:start w:val="1"/>
+      <w:numFmt w:val="decimal"/>
+      <w:lvlText w:val="%5."/>
+      <w:lvlJc w:val="left"/>
+      <w:pPr>
+        <w:tabs>
+          <w:tab w:val="num" w:pos="2160"/>
+        </w:tabs>
+        <w:ind w:left="2160" w:hanging="360"/>
+      </w:pPr>
+      <w:rPr/>
+    </w:lvl>
+    <w:lvl w:ilvl="5">
+      <w:start w:val="1"/>
+      <w:numFmt w:val="decimal"/>
+      <w:lvlText w:val="%6."/>
+      <w:lvlJc w:val="left"/>
+      <w:pPr>
+        <w:tabs>
+          <w:tab w:val="num" w:pos="2520"/>
+        </w:tabs>
+        <w:ind w:left="2520" w:hanging="360"/>
+      </w:pPr>
+      <w:rPr/>
+    </w:lvl>
+    <w:lvl w:ilvl="6">
+      <w:start w:val="1"/>
+      <w:numFmt w:val="decimal"/>
+      <w:lvlText w:val="%7."/>
+      <w:lvlJc w:val="left"/>
+      <w:pPr>
+        <w:tabs>
+          <w:tab w:val="num" w:pos="2880"/>
+        </w:tabs>
+        <w:ind w:left="2880" w:hanging="360"/>
+      </w:pPr>
+      <w:rPr/>
+    </w:lvl>
+    <w:lvl w:ilvl="7">
+      <w:start w:val="1"/>
+      <w:numFmt w:val="decimal"/>
+      <w:lvlText w:val="%8."/>
+      <w:lvlJc w:val="left"/>
+      <w:pPr>
+        <w:tabs>
+          <w:tab w:val="num" w:pos="3240"/>
+        </w:tabs>
+        <w:ind w:left="3240" w:hanging="360"/>
+      </w:pPr>
+      <w:rPr/>
+    </w:lvl>
+    <w:lvl w:ilvl="8">
+      <w:start w:val="1"/>
+      <w:numFmt w:val="decimal"/>
+      <w:lvlText w:val="%9."/>
+      <w:lvlJc w:val="left"/>
+      <w:pPr>
+        <w:tabs>
+          <w:tab w:val="num" w:pos="3600"/>
+        </w:tabs>
+        <w:ind w:left="3600" w:hanging="360"/>
+      </w:pPr>
+      <w:rPr/>
+    </w:lvl>
+  </w:abstractNum>
+  <w:abstractNum w:abstractNumId="13">
+    <w:lvl w:ilvl="0">
+      <w:start w:val="1"/>
+      <w:numFmt w:val="decimal"/>
+      <w:lvlText w:val="%1."/>
+      <w:lvlJc w:val="left"/>
+      <w:pPr>
+        <w:tabs>
+          <w:tab w:val="num" w:pos="0"/>
+        </w:tabs>
+        <w:ind w:left="720" w:hanging="360"/>
+      </w:pPr>
+      <w:rPr/>
+    </w:lvl>
+    <w:lvl w:ilvl="1">
+      <w:start w:val="1"/>
+      <w:numFmt w:val="decimal"/>
+      <w:lvlText w:val="%2."/>
+      <w:lvlJc w:val="left"/>
+      <w:pPr>
+        <w:tabs>
+          <w:tab w:val="num" w:pos="1080"/>
+        </w:tabs>
+        <w:ind w:left="1080" w:hanging="360"/>
+      </w:pPr>
+      <w:rPr/>
+    </w:lvl>
+    <w:lvl w:ilvl="2">
+      <w:start w:val="1"/>
+      <w:numFmt w:val="decimal"/>
+      <w:lvlText w:val="%3."/>
+      <w:lvlJc w:val="left"/>
+      <w:pPr>
+        <w:tabs>
+          <w:tab w:val="num" w:pos="1440"/>
+        </w:tabs>
+        <w:ind w:left="1440" w:hanging="360"/>
+      </w:pPr>
+      <w:rPr/>
+    </w:lvl>
+    <w:lvl w:ilvl="3">
+      <w:start w:val="1"/>
+      <w:numFmt w:val="decimal"/>
+      <w:lvlText w:val="%4."/>
+      <w:lvlJc w:val="left"/>
+      <w:pPr>
+        <w:tabs>
+          <w:tab w:val="num" w:pos="1800"/>
+        </w:tabs>
+        <w:ind w:left="1800" w:hanging="360"/>
+      </w:pPr>
+      <w:rPr/>
+    </w:lvl>
+    <w:lvl w:ilvl="4">
+      <w:start w:val="1"/>
+      <w:numFmt w:val="decimal"/>
+      <w:lvlText w:val="%5."/>
+      <w:lvlJc w:val="left"/>
+      <w:pPr>
+        <w:tabs>
+          <w:tab w:val="num" w:pos="2160"/>
+        </w:tabs>
+        <w:ind w:left="2160" w:hanging="360"/>
+      </w:pPr>
+      <w:rPr/>
+    </w:lvl>
+    <w:lvl w:ilvl="5">
+      <w:start w:val="1"/>
+      <w:numFmt w:val="decimal"/>
+      <w:lvlText w:val="%6."/>
+      <w:lvlJc w:val="left"/>
+      <w:pPr>
+        <w:tabs>
+          <w:tab w:val="num" w:pos="2520"/>
+        </w:tabs>
+        <w:ind w:left="2520" w:hanging="360"/>
+      </w:pPr>
+      <w:rPr/>
+    </w:lvl>
+    <w:lvl w:ilvl="6">
+      <w:start w:val="1"/>
+      <w:numFmt w:val="decimal"/>
+      <w:lvlText w:val="%7."/>
+      <w:lvlJc w:val="left"/>
+      <w:pPr>
+        <w:tabs>
+          <w:tab w:val="num" w:pos="2880"/>
+        </w:tabs>
+        <w:ind w:left="2880" w:hanging="360"/>
+      </w:pPr>
+      <w:rPr/>
+    </w:lvl>
+    <w:lvl w:ilvl="7">
+      <w:start w:val="1"/>
+      <w:numFmt w:val="decimal"/>
+      <w:lvlText w:val="%8."/>
+      <w:lvlJc w:val="left"/>
+      <w:pPr>
+        <w:tabs>
+          <w:tab w:val="num" w:pos="3240"/>
+        </w:tabs>
+        <w:ind w:left="3240" w:hanging="360"/>
+      </w:pPr>
+      <w:rPr/>
+    </w:lvl>
+    <w:lvl w:ilvl="8">
+      <w:start w:val="1"/>
+      <w:numFmt w:val="decimal"/>
+      <w:lvlText w:val="%9."/>
+      <w:lvlJc w:val="left"/>
+      <w:pPr>
+        <w:tabs>
+          <w:tab w:val="num" w:pos="3600"/>
+        </w:tabs>
+        <w:ind w:left="3600" w:hanging="360"/>
+      </w:pPr>
+      <w:rPr/>
+    </w:lvl>
+  </w:abstractNum>
+  <w:abstractNum w:abstractNumId="14">
+    <w:lvl w:ilvl="0">
+      <w:start w:val="1"/>
+      <w:numFmt w:val="decimal"/>
+      <w:lvlText w:val="%1."/>
+      <w:lvlJc w:val="left"/>
+      <w:pPr>
+        <w:tabs>
+          <w:tab w:val="num" w:pos="0"/>
+        </w:tabs>
+        <w:ind w:left="720" w:hanging="360"/>
+      </w:pPr>
+      <w:rPr/>
+    </w:lvl>
+    <w:lvl w:ilvl="1">
+      <w:start w:val="1"/>
+      <w:numFmt w:val="decimal"/>
+      <w:lvlText w:val="%2."/>
+      <w:lvlJc w:val="left"/>
+      <w:pPr>
+        <w:tabs>
+          <w:tab w:val="num" w:pos="1080"/>
+        </w:tabs>
+        <w:ind w:left="1080" w:hanging="360"/>
+      </w:pPr>
+      <w:rPr/>
+    </w:lvl>
+    <w:lvl w:ilvl="2">
+      <w:start w:val="1"/>
+      <w:numFmt w:val="decimal"/>
+      <w:lvlText w:val="%3."/>
+      <w:lvlJc w:val="left"/>
+      <w:pPr>
+        <w:tabs>
+          <w:tab w:val="num" w:pos="1440"/>
+        </w:tabs>
+        <w:ind w:left="1440" w:hanging="360"/>
+      </w:pPr>
+      <w:rPr/>
+    </w:lvl>
+    <w:lvl w:ilvl="3">
+      <w:start w:val="1"/>
+      <w:numFmt w:val="decimal"/>
+      <w:lvlText w:val="%4."/>
+      <w:lvlJc w:val="left"/>
+      <w:pPr>
+        <w:tabs>
+          <w:tab w:val="num" w:pos="1800"/>
+        </w:tabs>
+        <w:ind w:left="1800" w:hanging="360"/>
+      </w:pPr>
+      <w:rPr/>
+    </w:lvl>
+    <w:lvl w:ilvl="4">
+      <w:start w:val="1"/>
+      <w:numFmt w:val="decimal"/>
+      <w:lvlText w:val="%5."/>
+      <w:lvlJc w:val="left"/>
+      <w:pPr>
+        <w:tabs>
+          <w:tab w:val="num" w:pos="2160"/>
+        </w:tabs>
+        <w:ind w:left="2160" w:hanging="360"/>
+      </w:pPr>
+      <w:rPr/>
+    </w:lvl>
+    <w:lvl w:ilvl="5">
+      <w:start w:val="1"/>
+      <w:numFmt w:val="decimal"/>
+      <w:lvlText w:val="%6."/>
+      <w:lvlJc w:val="left"/>
+      <w:pPr>
+        <w:tabs>
+          <w:tab w:val="num" w:pos="2520"/>
+        </w:tabs>
+        <w:ind w:left="2520" w:hanging="360"/>
+      </w:pPr>
+      <w:rPr/>
+    </w:lvl>
+    <w:lvl w:ilvl="6">
+      <w:start w:val="1"/>
+      <w:numFmt w:val="decimal"/>
+      <w:lvlText w:val="%7."/>
+      <w:lvlJc w:val="left"/>
+      <w:pPr>
+        <w:tabs>
+          <w:tab w:val="num" w:pos="2880"/>
+        </w:tabs>
+        <w:ind w:left="2880" w:hanging="360"/>
+      </w:pPr>
+      <w:rPr/>
+    </w:lvl>
+    <w:lvl w:ilvl="7">
+      <w:start w:val="1"/>
+      <w:numFmt w:val="decimal"/>
+      <w:lvlText w:val="%8."/>
+      <w:lvlJc w:val="left"/>
+      <w:pPr>
+        <w:tabs>
+          <w:tab w:val="num" w:pos="3240"/>
+        </w:tabs>
+        <w:ind w:left="3240" w:hanging="360"/>
+      </w:pPr>
+      <w:rPr/>
+    </w:lvl>
+    <w:lvl w:ilvl="8">
+      <w:start w:val="1"/>
+      <w:numFmt w:val="decimal"/>
+      <w:lvlText w:val="%9."/>
+      <w:lvlJc w:val="left"/>
+      <w:pPr>
+        <w:tabs>
+          <w:tab w:val="num" w:pos="3600"/>
+        </w:tabs>
+        <w:ind w:left="3600" w:hanging="360"/>
+      </w:pPr>
+      <w:rPr/>
+    </w:lvl>
+  </w:abstractNum>
+  <w:abstractNum w:abstractNumId="15">
+    <w:lvl w:ilvl="0">
+      <w:start w:val="1"/>
+      <w:numFmt w:val="decimal"/>
+      <w:lvlText w:val="%1."/>
+      <w:lvlJc w:val="left"/>
+      <w:pPr>
+        <w:tabs>
+          <w:tab w:val="num" w:pos="0"/>
+        </w:tabs>
+        <w:ind w:left="720" w:hanging="360"/>
+      </w:pPr>
+      <w:rPr/>
+    </w:lvl>
+    <w:lvl w:ilvl="1">
+      <w:start w:val="1"/>
+      <w:numFmt w:val="decimal"/>
+      <w:lvlText w:val="%2."/>
+      <w:lvlJc w:val="left"/>
+      <w:pPr>
+        <w:tabs>
+          <w:tab w:val="num" w:pos="1080"/>
+        </w:tabs>
+        <w:ind w:left="1080" w:hanging="360"/>
+      </w:pPr>
+      <w:rPr/>
+    </w:lvl>
+    <w:lvl w:ilvl="2">
+      <w:start w:val="1"/>
+      <w:numFmt w:val="decimal"/>
+      <w:lvlText w:val="%3."/>
+      <w:lvlJc w:val="left"/>
+      <w:pPr>
+        <w:tabs>
+          <w:tab w:val="num" w:pos="1440"/>
+        </w:tabs>
+        <w:ind w:left="1440" w:hanging="360"/>
+      </w:pPr>
+      <w:rPr/>
+    </w:lvl>
+    <w:lvl w:ilvl="3">
+      <w:start w:val="1"/>
+      <w:numFmt w:val="decimal"/>
+      <w:lvlText w:val="%4."/>
+      <w:lvlJc w:val="left"/>
+      <w:pPr>
+        <w:tabs>
+          <w:tab w:val="num" w:pos="1800"/>
+        </w:tabs>
+        <w:ind w:left="1800" w:hanging="360"/>
+      </w:pPr>
+      <w:rPr/>
+    </w:lvl>
+    <w:lvl w:ilvl="4">
+      <w:start w:val="1"/>
+      <w:numFmt w:val="decimal"/>
+      <w:lvlText w:val="%5."/>
+      <w:lvlJc w:val="left"/>
+      <w:pPr>
+        <w:tabs>
+          <w:tab w:val="num" w:pos="2160"/>
+        </w:tabs>
+        <w:ind w:left="2160" w:hanging="360"/>
+      </w:pPr>
+      <w:rPr/>
+    </w:lvl>
+    <w:lvl w:ilvl="5">
+      <w:start w:val="1"/>
+      <w:numFmt w:val="decimal"/>
+      <w:lvlText w:val="%6."/>
+      <w:lvlJc w:val="left"/>
+      <w:pPr>
+        <w:tabs>
+          <w:tab w:val="num" w:pos="2520"/>
+        </w:tabs>
+        <w:ind w:left="2520" w:hanging="360"/>
+      </w:pPr>
+      <w:rPr/>
+    </w:lvl>
+    <w:lvl w:ilvl="6">
+      <w:start w:val="1"/>
+      <w:numFmt w:val="decimal"/>
+      <w:lvlText w:val="%7."/>
+      <w:lvlJc w:val="left"/>
+      <w:pPr>
+        <w:tabs>
+          <w:tab w:val="num" w:pos="2880"/>
+        </w:tabs>
+        <w:ind w:left="2880" w:hanging="360"/>
+      </w:pPr>
+      <w:rPr/>
+    </w:lvl>
+    <w:lvl w:ilvl="7">
+      <w:start w:val="1"/>
+      <w:numFmt w:val="decimal"/>
+      <w:lvlText w:val="%8."/>
+      <w:lvlJc w:val="left"/>
+      <w:pPr>
+        <w:tabs>
+          <w:tab w:val="num" w:pos="3240"/>
+        </w:tabs>
+        <w:ind w:left="3240" w:hanging="360"/>
+      </w:pPr>
+      <w:rPr/>
+    </w:lvl>
+    <w:lvl w:ilvl="8">
+      <w:start w:val="1"/>
+      <w:numFmt w:val="decimal"/>
+      <w:lvlText w:val="%9."/>
+      <w:lvlJc w:val="left"/>
+      <w:pPr>
+        <w:tabs>
+          <w:tab w:val="num" w:pos="3600"/>
+        </w:tabs>
+        <w:ind w:left="3600" w:hanging="360"/>
+      </w:pPr>
+      <w:rPr/>
+    </w:lvl>
+  </w:abstractNum>
+  <w:abstractNum w:abstractNumId="16">
+    <w:lvl w:ilvl="0">
+      <w:start w:val="1"/>
+      <w:numFmt w:val="decimal"/>
+      <w:lvlText w:val="%1."/>
+      <w:lvlJc w:val="left"/>
+      <w:pPr>
+        <w:tabs>
+          <w:tab w:val="num" w:pos="0"/>
+        </w:tabs>
+        <w:ind w:left="720" w:hanging="360"/>
+      </w:pPr>
+      <w:rPr/>
+    </w:lvl>
+    <w:lvl w:ilvl="1">
+      <w:start w:val="1"/>
+      <w:numFmt w:val="decimal"/>
+      <w:lvlText w:val="%2."/>
+      <w:lvlJc w:val="left"/>
+      <w:pPr>
+        <w:tabs>
+          <w:tab w:val="num" w:pos="1080"/>
+        </w:tabs>
+        <w:ind w:left="1080" w:hanging="360"/>
+      </w:pPr>
+      <w:rPr/>
+    </w:lvl>
+    <w:lvl w:ilvl="2">
+      <w:start w:val="1"/>
+      <w:numFmt w:val="decimal"/>
+      <w:lvlText w:val="%3."/>
+      <w:lvlJc w:val="left"/>
+      <w:pPr>
+        <w:tabs>
+          <w:tab w:val="num" w:pos="1440"/>
+        </w:tabs>
+        <w:ind w:left="1440" w:hanging="360"/>
+      </w:pPr>
+      <w:rPr/>
+    </w:lvl>
+    <w:lvl w:ilvl="3">
+      <w:start w:val="1"/>
+      <w:numFmt w:val="decimal"/>
+      <w:lvlText w:val="%4."/>
+      <w:lvlJc w:val="left"/>
+      <w:pPr>
+        <w:tabs>
+          <w:tab w:val="num" w:pos="1800"/>
+        </w:tabs>
+        <w:ind w:left="1800" w:hanging="360"/>
+      </w:pPr>
+      <w:rPr/>
+    </w:lvl>
+    <w:lvl w:ilvl="4">
+      <w:start w:val="1"/>
+      <w:numFmt w:val="decimal"/>
+      <w:lvlText w:val="%5."/>
+      <w:lvlJc w:val="left"/>
+      <w:pPr>
+        <w:tabs>
+          <w:tab w:val="num" w:pos="2160"/>
+        </w:tabs>
+        <w:ind w:left="2160" w:hanging="360"/>
+      </w:pPr>
+      <w:rPr/>
+    </w:lvl>
+    <w:lvl w:ilvl="5">
+      <w:start w:val="1"/>
+      <w:numFmt w:val="decimal"/>
+      <w:lvlText w:val="%6."/>
+      <w:lvlJc w:val="left"/>
+      <w:pPr>
+        <w:tabs>
+          <w:tab w:val="num" w:pos="2520"/>
+        </w:tabs>
+        <w:ind w:left="2520" w:hanging="360"/>
+      </w:pPr>
+      <w:rPr/>
+    </w:lvl>
+    <w:lvl w:ilvl="6">
+      <w:start w:val="1"/>
+      <w:numFmt w:val="decimal"/>
+      <w:lvlText w:val="%7."/>
+      <w:lvlJc w:val="left"/>
+      <w:pPr>
+        <w:tabs>
+          <w:tab w:val="num" w:pos="2880"/>
+        </w:tabs>
+        <w:ind w:left="2880" w:hanging="360"/>
+      </w:pPr>
+      <w:rPr/>
+    </w:lvl>
+    <w:lvl w:ilvl="7">
+      <w:start w:val="1"/>
+      <w:numFmt w:val="decimal"/>
+      <w:lvlText w:val="%8."/>
+      <w:lvlJc w:val="left"/>
+      <w:pPr>
+        <w:tabs>
+          <w:tab w:val="num" w:pos="3240"/>
+        </w:tabs>
+        <w:ind w:left="3240" w:hanging="360"/>
+      </w:pPr>
+      <w:rPr/>
+    </w:lvl>
+    <w:lvl w:ilvl="8">
+      <w:start w:val="1"/>
+      <w:numFmt w:val="decimal"/>
+      <w:lvlText w:val="%9."/>
+      <w:lvlJc w:val="left"/>
+      <w:pPr>
+        <w:tabs>
+          <w:tab w:val="num" w:pos="3600"/>
+        </w:tabs>
+        <w:ind w:left="3600" w:hanging="360"/>
+      </w:pPr>
+      <w:rPr/>
+    </w:lvl>
+  </w:abstractNum>
+  <w:abstractNum w:abstractNumId="17">
+    <w:lvl w:ilvl="0">
+      <w:start w:val="1"/>
+      <w:numFmt w:val="bullet"/>
+      <w:lvlText w:val=""/>
+      <w:lvlJc w:val="left"/>
+      <w:pPr>
+        <w:tabs>
+          <w:tab w:val="num" w:pos="0"/>
+        </w:tabs>
+        <w:ind w:left="720" w:hanging="360"/>
+      </w:pPr>
+      <w:rPr>
+        <w:rFonts w:ascii="Symbol" w:hAnsi="Symbol" w:cs="Symbol" w:hint="default"/>
+      </w:rPr>
+    </w:lvl>
+    <w:lvl w:ilvl="1">
+      <w:start w:val="1"/>
+      <w:numFmt w:val="decimal"/>
+      <w:lvlText w:val="%2."/>
+      <w:lvlJc w:val="left"/>
+      <w:pPr>
+        <w:tabs>
+          <w:tab w:val="num" w:pos="1080"/>
+        </w:tabs>
+        <w:ind w:left="1080" w:hanging="360"/>
+      </w:pPr>
+      <w:rPr/>
+    </w:lvl>
+    <w:lvl w:ilvl="2">
+      <w:start w:val="1"/>
+      <w:numFmt w:val="decimal"/>
+      <w:lvlText w:val="%3."/>
+      <w:lvlJc w:val="left"/>
+      <w:pPr>
+        <w:tabs>
+          <w:tab w:val="num" w:pos="1440"/>
+        </w:tabs>
+        <w:ind w:left="1440" w:hanging="360"/>
+      </w:pPr>
+      <w:rPr/>
+    </w:lvl>
+    <w:lvl w:ilvl="3">
+      <w:start w:val="1"/>
+      <w:numFmt w:val="decimal"/>
+      <w:lvlText w:val="%4."/>
+      <w:lvlJc w:val="left"/>
+      <w:pPr>
+        <w:tabs>
+          <w:tab w:val="num" w:pos="1800"/>
+        </w:tabs>
+        <w:ind w:left="1800" w:hanging="360"/>
+      </w:pPr>
+      <w:rPr/>
+    </w:lvl>
+    <w:lvl w:ilvl="4">
+      <w:start w:val="1"/>
+      <w:numFmt w:val="decimal"/>
+      <w:lvlText w:val="%5."/>
+      <w:lvlJc w:val="left"/>
+      <w:pPr>
+        <w:tabs>
+          <w:tab w:val="num" w:pos="2160"/>
+        </w:tabs>
+        <w:ind w:left="2160" w:hanging="360"/>
+      </w:pPr>
+      <w:rPr/>
+    </w:lvl>
+    <w:lvl w:ilvl="5">
+      <w:start w:val="1"/>
+      <w:numFmt w:val="decimal"/>
+      <w:lvlText w:val="%6."/>
+      <w:lvlJc w:val="left"/>
+      <w:pPr>
+        <w:tabs>
+          <w:tab w:val="num" w:pos="2520"/>
+        </w:tabs>
+        <w:ind w:left="2520" w:hanging="360"/>
+      </w:pPr>
+      <w:rPr/>
+    </w:lvl>
+    <w:lvl w:ilvl="6">
+      <w:start w:val="1"/>
+      <w:numFmt w:val="decimal"/>
+      <w:lvlText w:val="%7."/>
+      <w:lvlJc w:val="left"/>
+      <w:pPr>
+        <w:tabs>
+          <w:tab w:val="num" w:pos="2880"/>
+        </w:tabs>
+        <w:ind w:left="2880" w:hanging="360"/>
+      </w:pPr>
+      <w:rPr/>
+    </w:lvl>
+    <w:lvl w:ilvl="7">
+      <w:start w:val="1"/>
+      <w:numFmt w:val="decimal"/>
+      <w:lvlText w:val="%8."/>
+      <w:lvlJc w:val="left"/>
+      <w:pPr>
+        <w:tabs>
+          <w:tab w:val="num" w:pos="3240"/>
+        </w:tabs>
+        <w:ind w:left="3240" w:hanging="360"/>
+      </w:pPr>
+      <w:rPr/>
+    </w:lvl>
+    <w:lvl w:ilvl="8">
+      <w:start w:val="1"/>
+      <w:numFmt w:val="decimal"/>
+      <w:lvlText w:val="%9."/>
+      <w:lvlJc w:val="left"/>
+      <w:pPr>
+        <w:tabs>
+          <w:tab w:val="num" w:pos="3600"/>
+        </w:tabs>
+        <w:ind w:left="3600" w:hanging="360"/>
+      </w:pPr>
+      <w:rPr/>
+    </w:lvl>
+  </w:abstractNum>
+  <w:abstractNum w:abstractNumId="18">
+    <w:lvl w:ilvl="0">
+      <w:start w:val="1"/>
+      <w:numFmt w:val="bullet"/>
+      <w:lvlText w:val=""/>
+      <w:lvlJc w:val="left"/>
+      <w:pPr>
+        <w:tabs>
+          <w:tab w:val="num" w:pos="0"/>
+        </w:tabs>
+        <w:ind w:left="720" w:hanging="360"/>
+      </w:pPr>
+      <w:rPr>
+        <w:rFonts w:ascii="Symbol" w:hAnsi="Symbol" w:cs="Symbol" w:hint="default"/>
+      </w:rPr>
+    </w:lvl>
+    <w:lvl w:ilvl="1">
+      <w:start w:val="1"/>
+      <w:numFmt w:val="decimal"/>
+      <w:lvlText w:val="%2."/>
+      <w:lvlJc w:val="left"/>
+      <w:pPr>
+        <w:tabs>
+          <w:tab w:val="num" w:pos="1080"/>
+        </w:tabs>
+        <w:ind w:left="1080" w:hanging="360"/>
+      </w:pPr>
+      <w:rPr/>
+    </w:lvl>
+    <w:lvl w:ilvl="2">
+      <w:start w:val="1"/>
+      <w:numFmt w:val="decimal"/>
+      <w:lvlText w:val="%3."/>
+      <w:lvlJc w:val="left"/>
+      <w:pPr>
+        <w:tabs>
+          <w:tab w:val="num" w:pos="1440"/>
+        </w:tabs>
+        <w:ind w:left="1440" w:hanging="360"/>
+      </w:pPr>
+      <w:rPr/>
+    </w:lvl>
+    <w:lvl w:ilvl="3">
+      <w:start w:val="1"/>
+      <w:numFmt w:val="decimal"/>
+      <w:lvlText w:val="%4."/>
+      <w:lvlJc w:val="left"/>
+      <w:pPr>
+        <w:tabs>
+          <w:tab w:val="num" w:pos="1800"/>
+        </w:tabs>
+        <w:ind w:left="1800" w:hanging="360"/>
+      </w:pPr>
+      <w:rPr/>
+    </w:lvl>
+    <w:lvl w:ilvl="4">
+      <w:start w:val="1"/>
+      <w:numFmt w:val="decimal"/>
+      <w:lvlText w:val="%5."/>
+      <w:lvlJc w:val="left"/>
+      <w:pPr>
+        <w:tabs>
+          <w:tab w:val="num" w:pos="2160"/>
+        </w:tabs>
+        <w:ind w:left="2160" w:hanging="360"/>
+      </w:pPr>
+      <w:rPr/>
+    </w:lvl>
+    <w:lvl w:ilvl="5">
+      <w:start w:val="1"/>
+      <w:numFmt w:val="decimal"/>
+      <w:lvlText w:val="%6."/>
+      <w:lvlJc w:val="left"/>
+      <w:pPr>
+        <w:tabs>
+          <w:tab w:val="num" w:pos="2520"/>
+        </w:tabs>
+        <w:ind w:left="2520" w:hanging="360"/>
+      </w:pPr>
+      <w:rPr/>
+    </w:lvl>
+    <w:lvl w:ilvl="6">
+      <w:start w:val="1"/>
+      <w:numFmt w:val="decimal"/>
+      <w:lvlText w:val="%7."/>
+      <w:lvlJc w:val="left"/>
+      <w:pPr>
+        <w:tabs>
+          <w:tab w:val="num" w:pos="2880"/>
+        </w:tabs>
+        <w:ind w:left="2880" w:hanging="360"/>
+      </w:pPr>
+      <w:rPr/>
+    </w:lvl>
+    <w:lvl w:ilvl="7">
+      <w:start w:val="1"/>
+      <w:numFmt w:val="decimal"/>
+      <w:lvlText w:val="%8."/>
+      <w:lvlJc w:val="left"/>
+      <w:pPr>
+        <w:tabs>
+          <w:tab w:val="num" w:pos="3240"/>
+        </w:tabs>
+        <w:ind w:left="3240" w:hanging="360"/>
+      </w:pPr>
+      <w:rPr/>
+    </w:lvl>
+    <w:lvl w:ilvl="8">
+      <w:start w:val="1"/>
+      <w:numFmt w:val="decimal"/>
+      <w:lvlText w:val="%9."/>
+      <w:lvlJc w:val="left"/>
+      <w:pPr>
+        <w:tabs>
+          <w:tab w:val="num" w:pos="3600"/>
+        </w:tabs>
+        <w:ind w:left="3600" w:hanging="360"/>
+      </w:pPr>
+      <w:rPr/>
+    </w:lvl>
+  </w:abstractNum>
+  <w:abstractNum w:abstractNumId="19">
+    <w:lvl w:ilvl="0">
+      <w:start w:val="1"/>
+      <w:numFmt w:val="bullet"/>
+      <w:lvlText w:val=""/>
+      <w:lvlJc w:val="left"/>
+      <w:pPr>
+        <w:tabs>
+          <w:tab w:val="num" w:pos="0"/>
+        </w:tabs>
+        <w:ind w:left="720" w:hanging="360"/>
+      </w:pPr>
+      <w:rPr>
+        <w:rFonts w:ascii="Symbol" w:hAnsi="Symbol" w:cs="Symbol" w:hint="default"/>
+      </w:rPr>
+    </w:lvl>
+    <w:lvl w:ilvl="1">
+      <w:start w:val="1"/>
+      <w:numFmt w:val="decimal"/>
+      <w:lvlText w:val="%2."/>
+      <w:lvlJc w:val="left"/>
+      <w:pPr>
+        <w:tabs>
+          <w:tab w:val="num" w:pos="1080"/>
+        </w:tabs>
+        <w:ind w:left="1080" w:hanging="360"/>
+      </w:pPr>
+      <w:rPr/>
+    </w:lvl>
+    <w:lvl w:ilvl="2">
+      <w:start w:val="1"/>
+      <w:numFmt w:val="decimal"/>
+      <w:lvlText w:val="%3."/>
+      <w:lvlJc w:val="left"/>
+      <w:pPr>
+        <w:tabs>
+          <w:tab w:val="num" w:pos="1440"/>
+        </w:tabs>
+        <w:ind w:left="1440" w:hanging="360"/>
+      </w:pPr>
+      <w:rPr/>
+    </w:lvl>
+    <w:lvl w:ilvl="3">
+      <w:start w:val="1"/>
+      <w:numFmt w:val="decimal"/>
+      <w:lvlText w:val="%4."/>
+      <w:lvlJc w:val="left"/>
+      <w:pPr>
+        <w:tabs>
+          <w:tab w:val="num" w:pos="1800"/>
+        </w:tabs>
+        <w:ind w:left="1800" w:hanging="360"/>
+      </w:pPr>
+      <w:rPr/>
+    </w:lvl>
+    <w:lvl w:ilvl="4">
+      <w:start w:val="1"/>
+      <w:numFmt w:val="decimal"/>
+      <w:lvlText w:val="%5."/>
+      <w:lvlJc w:val="left"/>
+      <w:pPr>
+        <w:tabs>
+          <w:tab w:val="num" w:pos="2160"/>
+        </w:tabs>
+        <w:ind w:left="2160" w:hanging="360"/>
+      </w:pPr>
+      <w:rPr/>
+    </w:lvl>
+    <w:lvl w:ilvl="5">
+      <w:start w:val="1"/>
+      <w:numFmt w:val="decimal"/>
+      <w:lvlText w:val="%6."/>
+      <w:lvlJc w:val="left"/>
+      <w:pPr>
+        <w:tabs>
+          <w:tab w:val="num" w:pos="2520"/>
+        </w:tabs>
+        <w:ind w:left="2520" w:hanging="360"/>
+      </w:pPr>
+      <w:rPr/>
+    </w:lvl>
+    <w:lvl w:ilvl="6">
+      <w:start w:val="1"/>
+      <w:numFmt w:val="decimal"/>
+      <w:lvlText w:val="%7."/>
+      <w:lvlJc w:val="left"/>
+      <w:pPr>
+        <w:tabs>
+          <w:tab w:val="num" w:pos="2880"/>
+        </w:tabs>
+        <w:ind w:left="2880" w:hanging="360"/>
+      </w:pPr>
+      <w:rPr/>
+    </w:lvl>
+    <w:lvl w:ilvl="7">
+      <w:start w:val="1"/>
+      <w:numFmt w:val="decimal"/>
+      <w:lvlText w:val="%8."/>
+      <w:lvlJc w:val="left"/>
+      <w:pPr>
+        <w:tabs>
+          <w:tab w:val="num" w:pos="3240"/>
+        </w:tabs>
+        <w:ind w:left="3240" w:hanging="360"/>
+      </w:pPr>
+      <w:rPr/>
+    </w:lvl>
+    <w:lvl w:ilvl="8">
+      <w:start w:val="1"/>
+      <w:numFmt w:val="decimal"/>
+      <w:lvlText w:val="%9."/>
+      <w:lvlJc w:val="left"/>
+      <w:pPr>
+        <w:tabs>
+          <w:tab w:val="num" w:pos="3600"/>
+        </w:tabs>
+        <w:ind w:left="3600" w:hanging="360"/>
+      </w:pPr>
+      <w:rPr/>
+    </w:lvl>
+  </w:abstractNum>
+  <w:abstractNum w:abstractNumId="20">
     <w:lvl w:ilvl="0">
       <w:start w:val="1"/>
       <w:numFmt w:val="none"/>
@@ -3006,70 +4507,109 @@
     <w:abstractNumId w:val="7"/>
   </w:num>
   <w:num w:numId="8">
-    <w:abstractNumId w:val="4"/>
+    <w:abstractNumId w:val="8"/>
+  </w:num>
+  <w:num w:numId="9">
+    <w:abstractNumId w:val="9"/>
+  </w:num>
+  <w:num w:numId="10">
+    <w:abstractNumId w:val="10"/>
+  </w:num>
+  <w:num w:numId="11">
+    <w:abstractNumId w:val="11"/>
+  </w:num>
+  <w:num w:numId="12">
+    <w:abstractNumId w:val="12"/>
+  </w:num>
+  <w:num w:numId="13">
+    <w:abstractNumId w:val="13"/>
+  </w:num>
+  <w:num w:numId="14">
+    <w:abstractNumId w:val="14"/>
+  </w:num>
+  <w:num w:numId="15">
+    <w:abstractNumId w:val="15"/>
+  </w:num>
+  <w:num w:numId="16">
+    <w:abstractNumId w:val="16"/>
+  </w:num>
+  <w:num w:numId="17">
+    <w:abstractNumId w:val="17"/>
+  </w:num>
+  <w:num w:numId="18">
+    <w:abstractNumId w:val="18"/>
+  </w:num>
+  <w:num w:numId="19">
+    <w:abstractNumId w:val="19"/>
+  </w:num>
+  <w:num w:numId="20">
+    <w:abstractNumId w:val="20"/>
+  </w:num>
+  <w:num w:numId="21">
+    <w:abstractNumId w:val="1"/>
     <w:lvlOverride w:ilvl="0">
       <w:startOverride w:val="1"/>
     </w:lvlOverride>
   </w:num>
-  <w:num w:numId="9">
-    <w:abstractNumId w:val="4"/>
+  <w:num w:numId="22">
+    <w:abstractNumId w:val="1"/>
   </w:num>
-  <w:num w:numId="10">
-    <w:abstractNumId w:val="4"/>
+  <w:num w:numId="23">
+    <w:abstractNumId w:val="1"/>
   </w:num>
-  <w:num w:numId="11">
-    <w:abstractNumId w:val="4"/>
+  <w:num w:numId="24">
+    <w:abstractNumId w:val="1"/>
   </w:num>
-  <w:num w:numId="12">
-    <w:abstractNumId w:val="4"/>
+  <w:num w:numId="25">
+    <w:abstractNumId w:val="1"/>
   </w:num>
-  <w:num w:numId="13">
-    <w:abstractNumId w:val="4"/>
+  <w:num w:numId="26">
+    <w:abstractNumId w:val="1"/>
   </w:num>
-  <w:num w:numId="14">
-    <w:abstractNumId w:val="4"/>
+  <w:num w:numId="27">
+    <w:abstractNumId w:val="1"/>
   </w:num>
-  <w:num w:numId="15">
-    <w:abstractNumId w:val="4"/>
+  <w:num w:numId="28">
+    <w:abstractNumId w:val="1"/>
   </w:num>
-  <w:num w:numId="16">
-    <w:abstractNumId w:val="5"/>
+  <w:num w:numId="29">
+    <w:abstractNumId w:val="9"/>
     <w:lvlOverride w:ilvl="0">
       <w:startOverride w:val="1"/>
     </w:lvlOverride>
   </w:num>
-  <w:num w:numId="17">
-    <w:abstractNumId w:val="5"/>
+  <w:num w:numId="30">
+    <w:abstractNumId w:val="9"/>
   </w:num>
-  <w:num w:numId="18">
-    <w:abstractNumId w:val="5"/>
+  <w:num w:numId="31">
+    <w:abstractNumId w:val="9"/>
   </w:num>
-  <w:num w:numId="19">
-    <w:abstractNumId w:val="5"/>
+  <w:num w:numId="32">
+    <w:abstractNumId w:val="9"/>
   </w:num>
-  <w:num w:numId="20">
-    <w:abstractNumId w:val="6"/>
+  <w:num w:numId="33">
+    <w:abstractNumId w:val="13"/>
     <w:lvlOverride w:ilvl="0">
       <w:startOverride w:val="1"/>
     </w:lvlOverride>
   </w:num>
-  <w:num w:numId="21">
-    <w:abstractNumId w:val="6"/>
+  <w:num w:numId="34">
+    <w:abstractNumId w:val="13"/>
   </w:num>
-  <w:num w:numId="22">
-    <w:abstractNumId w:val="6"/>
+  <w:num w:numId="35">
+    <w:abstractNumId w:val="13"/>
   </w:num>
-  <w:num w:numId="23">
-    <w:abstractNumId w:val="6"/>
+  <w:num w:numId="36">
+    <w:abstractNumId w:val="13"/>
   </w:num>
-  <w:num w:numId="24">
-    <w:abstractNumId w:val="4"/>
+  <w:num w:numId="37">
+    <w:abstractNumId w:val="1"/>
   </w:num>
-  <w:num w:numId="25">
-    <w:abstractNumId w:val="4"/>
+  <w:num w:numId="38">
+    <w:abstractNumId w:val="1"/>
   </w:num>
-  <w:num w:numId="26">
-    <w:abstractNumId w:val="4"/>
+  <w:num w:numId="39">
+    <w:abstractNumId w:val="1"/>
   </w:num>
 </w:numbering>
 </file>

</xml_diff>